<commit_message>
Document approval-matrix mocked-email + process-halt behavior in US-07 doc
Keep the manager summary in sync with the implemented behavior: when approval
is required from an approver other than the CSR, the system shows the mocked
"Triggered email to respective approver and awaiting approval." message and
halts with no further actions. Updated generate_story_docs.py (US-07 how/AC-02/
scenario) and regenerated sample-data/US-07/US-07_Summary_for_Manager.docx.

Co-authored-by: Cursor <cursoragent@cursor.com>
</commit_message>
<xml_diff>
--- a/sample-data/US-07/US-07_Summary_for_Manager.docx
+++ b/sample-data/US-07/US-07_Summary_for_Manager.docx
@@ -513,7 +513,7 @@
         <w:rPr>
           <w:sz w:val="20"/>
         </w:rPr>
-        <w:t>An APPROVAL_REQUIRED task names the approver, level, threshold range, and SLA (sample: scenario-approval-required.txt).</w:t>
+        <w:t>An APPROVAL_REQUIRED task names the approver, level, threshold range, and SLA. Because approval is needed from an approver other than the CSR, the system displays a mocked message 'Triggered email to respective approver and awaiting approval.' and then stops - no further actions execute until a response is received (sample: scenario-approval-required.txt).</w:t>
       </w:r>
     </w:p>
     <w:p>
@@ -686,7 +686,7 @@
     </w:p>
     <w:p>
       <w:r>
-        <w:t>The order value is compared to the cost-center and branch available budget. If within budget and the buyer's self-approval authority, the order is auto-approved. Otherwise the approval matrix identifies the correct approver (branch -&gt; regional -&gt; global) and an approval task is created, pausing the order.</w:t>
+        <w:t>The order value is compared to the cost-center and branch available budget. If within budget and the buyer's self-approval authority, the order is auto-approved. Otherwise the approval matrix identifies the correct approver (branch -&gt; regional -&gt; global) and an approval task is created, pausing the order. When approval is required from an approver other than the CSR, the system shows a mocked notification - 'Triggered email to respective approver and awaiting approval.' - and then halts: no further stages run until the approval is granted or rejected.</w:t>
       </w:r>
     </w:p>
     <w:tbl>
@@ -1019,7 +1019,7 @@
           </w:tcPr>
           <w:p>
             <w:r>
-              <w:t>APPROVAL_REQUIRED (order &gt; buyer self-approval limit)</w:t>
+              <w:t>APPROVAL_REQUIRED -&gt; mocked approver email sent, process halted</w:t>
             </w:r>
           </w:p>
         </w:tc>

</xml_diff>